<commit_message>
Add scientific attribution footnote to Temporal Depth Theorem
</commit_message>
<xml_diff>
--- a/docs/The_Temporal_Mechanics_of_Consciousness_Thomas_Riebl.docx
+++ b/docs/The_Temporal_Mechanics_of_Consciousness_Thomas_Riebl.docx
@@ -2,7 +2,7 @@
 <file path=word/document.xml><?xml version="1.0" encoding="utf-8"?>
 <w:document xmlns:w="http://schemas.openxmlformats.org/wordprocessingml/2006/main" xmlns:m="http://schemas.openxmlformats.org/officeDocument/2006/math" xmlns:r="http://schemas.openxmlformats.org/officeDocument/2006/relationships" xmlns:o="urn:schemas-microsoft-com:office:office" xmlns:v="urn:schemas-microsoft-com:vml" xmlns:w10="urn:schemas-microsoft-com:office:word" xmlns:a="http://schemas.openxmlformats.org/drawingml/2006/main" xmlns:pic="http://schemas.openxmlformats.org/drawingml/2006/picture" xmlns:wp="http://schemas.openxmlformats.org/drawingml/2006/wordprocessingDrawing">
   <w:body>
-    <w:bookmarkStart w:id="24" w:name="Xd735bbad6c758ad49b5e493322cd58a794e5088"/>
+    <w:bookmarkStart w:id="25" w:name="Xd735bbad6c758ad49b5e493322cd58a794e5088"/>
     <w:p>
       <w:pPr>
         <w:pStyle w:val="Heading1"/>
@@ -1503,7 +1503,7 @@
       </w:r>
     </w:p>
     <w:bookmarkEnd w:id="14"/>
-    <w:bookmarkStart w:id="16" w:name="Xb25eb8b24c0bfb3ad5eea7fca740290d94ba3ad"/>
+    <w:bookmarkStart w:id="17" w:name="Xb25eb8b24c0bfb3ad5eea7fca740290d94ba3ad"/>
     <w:p>
       <w:pPr>
         <w:pStyle w:val="Heading2"/>
@@ -2022,7 +2022,7 @@
         </m:oMath>
       </m:oMathPara>
     </w:p>
-    <w:bookmarkStart w:id="15" w:name="the-temporal-depth-hierarchy"/>
+    <w:bookmarkStart w:id="16" w:name="the-temporal-depth-hierarchy"/>
     <w:p>
       <w:pPr>
         <w:pStyle w:val="Heading3"/>
@@ -2264,6 +2264,15 @@
         </w:rPr>
         <w:t xml:space="preserve">).</w:t>
       </w:r>
+      <w:r>
+        <w:t xml:space="preserve"> </w:t>
+      </w:r>
+      <w:r>
+        <w:rPr>
+          <w:rStyle w:val="FootnoteReference"/>
+        </w:rPr>
+        <w:footnoteReference w:id="15"/>
+      </w:r>
     </w:p>
     <w:p>
       <w:r>
@@ -2272,9 +2281,9 @@
         </w:pict>
       </w:r>
     </w:p>
-    <w:bookmarkEnd w:id="15"/>
     <w:bookmarkEnd w:id="16"/>
-    <w:bookmarkStart w:id="18" w:name="X32ef92a38a51d9245eeeafa6d3bfa4ee61ada62"/>
+    <w:bookmarkEnd w:id="17"/>
+    <w:bookmarkStart w:id="19" w:name="X32ef92a38a51d9245eeeafa6d3bfa4ee61ada62"/>
     <w:p>
       <w:pPr>
         <w:pStyle w:val="Heading2"/>
@@ -2564,7 +2573,7 @@
         </m:oMath>
       </m:oMathPara>
     </w:p>
-    <w:bookmarkStart w:id="17" w:name="the-temporal-grain-tau"/>
+    <w:bookmarkStart w:id="18" w:name="the-temporal-grain-tau"/>
     <w:p>
       <w:pPr>
         <w:pStyle w:val="Heading3"/>
@@ -2818,9 +2827,9 @@
         </w:pict>
       </w:r>
     </w:p>
-    <w:bookmarkEnd w:id="17"/>
     <w:bookmarkEnd w:id="18"/>
-    <w:bookmarkStart w:id="19" w:name="Xdadfb61b269f97b5dc0ead88e3dbf72acab10ef"/>
+    <w:bookmarkEnd w:id="19"/>
+    <w:bookmarkStart w:id="20" w:name="Xdadfb61b269f97b5dc0ead88e3dbf72acab10ef"/>
     <w:p>
       <w:pPr>
         <w:pStyle w:val="Heading2"/>
@@ -3057,8 +3066,8 @@
         </w:pict>
       </w:r>
     </w:p>
-    <w:bookmarkEnd w:id="19"/>
-    <w:bookmarkStart w:id="20" w:name="X97ac54e22cce2fa7e9020293d7f9c0bf9a69dda"/>
+    <w:bookmarkEnd w:id="20"/>
+    <w:bookmarkStart w:id="21" w:name="X97ac54e22cce2fa7e9020293d7f9c0bf9a69dda"/>
     <w:p>
       <w:pPr>
         <w:pStyle w:val="Heading2"/>
@@ -3298,8 +3307,8 @@
         </w:pict>
       </w:r>
     </w:p>
-    <w:bookmarkEnd w:id="20"/>
-    <w:bookmarkStart w:id="22" w:name="conclusion-and-open-research-horizons"/>
+    <w:bookmarkEnd w:id="21"/>
+    <w:bookmarkStart w:id="23" w:name="conclusion-and-open-research-horizons"/>
     <w:p>
       <w:pPr>
         <w:pStyle w:val="Heading2"/>
@@ -3326,7 +3335,7 @@
         <w:t xml:space="preserve">Time as experienced is the operational signature of a dissociated conscious alter maintaining its existence against thermodynamic decay through deep active inference.</w:t>
       </w:r>
     </w:p>
-    <w:bookmarkStart w:id="21" w:name="key-conclusions"/>
+    <w:bookmarkStart w:id="22" w:name="key-conclusions"/>
     <w:p>
       <w:pPr>
         <w:pStyle w:val="Heading3"/>
@@ -3497,9 +3506,9 @@
         </w:pict>
       </w:r>
     </w:p>
-    <w:bookmarkEnd w:id="21"/>
     <w:bookmarkEnd w:id="22"/>
-    <w:bookmarkStart w:id="23" w:name="references-academic-bibliography"/>
+    <w:bookmarkEnd w:id="23"/>
+    <w:bookmarkStart w:id="24" w:name="references-academic-bibliography"/>
     <w:p>
       <w:pPr>
         <w:pStyle w:val="Heading2"/>
@@ -3971,8 +3980,8 @@
         <w:t xml:space="preserve">PLOS Computational Biology, 19(10), e1011465.</w:t>
       </w:r>
     </w:p>
-    <w:bookmarkEnd w:id="23"/>
     <w:bookmarkEnd w:id="24"/>
+    <w:bookmarkEnd w:id="25"/>
     <w:sectPr>
       <w:footnotePr>
         <w:numRestart w:val="eachSect"/>
@@ -3999,6 +4008,274 @@
     <w:p>
       <w:r>
         <w:separator/>
+      </w:r>
+    </w:p>
+  </w:footnote>
+  <w:footnote w:id="15">
+    <w:p>
+      <w:pPr>
+        <w:pStyle w:val="FootnoteText"/>
+      </w:pPr>
+      <w:r>
+        <w:rPr>
+          <w:rStyle w:val="FootnoteReference"/>
+        </w:rPr>
+        <w:footnoteRef/>
+      </w:r>
+      <w:r>
+        <w:t xml:space="preserve"> </w:t>
+      </w:r>
+      <w:r>
+        <w:rPr>
+          <w:b/>
+          <w:bCs/>
+        </w:rPr>
+        <w:t xml:space="preserve">Scientific Context &amp; Theoretical Attribution:</w:t>
+      </w:r>
+      <w:r>
+        <w:t xml:space="preserve"> </w:t>
+      </w:r>
+      <w:r>
+        <w:t xml:space="preserve">While Karl Friston et al. (2017, 2018) established temporal depth as a computational prerequisite for intentional action selection (</w:t>
+      </w:r>
+      <w:r>
+        <w:rPr>
+          <w:i/>
+          <w:iCs/>
+        </w:rPr>
+        <w:t xml:space="preserve">Planning as Inference</w:t>
+      </w:r>
+      <w:r>
+        <w:t xml:space="preserve">), and Anil Seth (2014, 2021) conceptualized</w:t>
+      </w:r>
+      <w:r>
+        <w:t xml:space="preserve"> </w:t>
+      </w:r>
+      <w:r>
+        <w:t xml:space="preserve">“counterfactual richness”</w:t>
+      </w:r>
+      <w:r>
+        <w:t xml:space="preserve"> </w:t>
+      </w:r>
+      <w:r>
+        <w:t xml:space="preserve">as a qualitative correlate of phenomenal presence, the</w:t>
+      </w:r>
+      <w:r>
+        <w:t xml:space="preserve"> </w:t>
+      </w:r>
+      <w:r>
+        <w:rPr>
+          <w:i/>
+          <w:iCs/>
+        </w:rPr>
+        <w:t xml:space="preserve">Conative-Integrative Framework (CIF)</w:t>
+      </w:r>
+      <w:r>
+        <w:t xml:space="preserve"> </w:t>
+      </w:r>
+      <w:r>
+        <w:t xml:space="preserve">by Thomas Riebl formalizes this insight for the first time as a strict mathematical</w:t>
+      </w:r>
+      <w:r>
+        <w:t xml:space="preserve"> </w:t>
+      </w:r>
+      <w:r>
+        <w:rPr>
+          <w:b/>
+          <w:bCs/>
+        </w:rPr>
+        <w:t xml:space="preserve">Theorem of Minimum Temporal Depth (</w:t>
+      </w:r>
+      <m:oMath>
+        <m:r>
+          <m:t>H</m:t>
+        </m:r>
+        <m:r>
+          <m:rPr>
+            <m:sty m:val="p"/>
+          </m:rPr>
+          <m:t>&gt;</m:t>
+        </m:r>
+        <m:r>
+          <m:t>1</m:t>
+        </m:r>
+      </m:oMath>
+      <w:r>
+        <w:rPr>
+          <w:b/>
+          <w:bCs/>
+        </w:rPr>
+        <w:t xml:space="preserve">) for Phenomenal Self-Consciousness</w:t>
+      </w:r>
+      <w:r>
+        <w:t xml:space="preserve">, directly coupled to the autopoietic preservation of Integrated Information (</w:t>
+      </w:r>
+      <m:oMath>
+        <m:r>
+          <m:rPr>
+            <m:sty m:val="p"/>
+          </m:rPr>
+          <m:t>Φ</m:t>
+        </m:r>
+      </m:oMath>
+      <w:r>
+        <w:t xml:space="preserve">) under the 6th Axiom (</w:t>
+      </w:r>
+      <m:oMath>
+        <m:r>
+          <m:rPr>
+            <m:scr m:val="double-struck"/>
+            <m:sty m:val="p"/>
+          </m:rPr>
+          <m:t>E</m:t>
+        </m:r>
+        <m:r>
+          <m:rPr>
+            <m:sty m:val="p"/>
+          </m:rPr>
+          <m:t>[</m:t>
+        </m:r>
+        <m:r>
+          <m:rPr>
+            <m:sty m:val="p"/>
+          </m:rPr>
+          <m:t>Φ</m:t>
+        </m:r>
+        <m:r>
+          <m:rPr>
+            <m:sty m:val="p"/>
+          </m:rPr>
+          <m:t>(</m:t>
+        </m:r>
+        <m:r>
+          <m:t>t</m:t>
+        </m:r>
+        <m:r>
+          <m:rPr>
+            <m:sty m:val="p"/>
+          </m:rPr>
+          <m:t>+</m:t>
+        </m:r>
+        <m:r>
+          <m:t>1</m:t>
+        </m:r>
+        <m:r>
+          <m:rPr>
+            <m:sty m:val="p"/>
+          </m:rPr>
+          <m:t>)</m:t>
+        </m:r>
+        <m:r>
+          <m:rPr>
+            <m:sty m:val="p"/>
+          </m:rPr>
+          <m:t>∣</m:t>
+        </m:r>
+        <m:sSup>
+          <m:e>
+            <m:r>
+              <m:t>π</m:t>
+            </m:r>
+          </m:e>
+          <m:sup>
+            <m:r>
+              <m:rPr>
+                <m:sty m:val="p"/>
+              </m:rPr>
+              <m:t>*</m:t>
+            </m:r>
+          </m:sup>
+        </m:sSup>
+        <m:r>
+          <m:rPr>
+            <m:sty m:val="p"/>
+          </m:rPr>
+          <m:t>]</m:t>
+        </m:r>
+        <m:r>
+          <m:rPr>
+            <m:sty m:val="p"/>
+          </m:rPr>
+          <m:t>≥</m:t>
+        </m:r>
+        <m:r>
+          <m:rPr>
+            <m:sty m:val="p"/>
+          </m:rPr>
+          <m:t>Φ</m:t>
+        </m:r>
+        <m:r>
+          <m:rPr>
+            <m:sty m:val="p"/>
+          </m:rPr>
+          <m:t>(</m:t>
+        </m:r>
+        <m:r>
+          <m:t>t</m:t>
+        </m:r>
+        <m:r>
+          <m:rPr>
+            <m:sty m:val="p"/>
+          </m:rPr>
+          <m:t>)</m:t>
+        </m:r>
+      </m:oMath>
+      <w:r>
+        <w:t xml:space="preserve">). This theorem formally proves that purely reactive automata (</w:t>
+      </w:r>
+      <m:oMath>
+        <m:r>
+          <m:t>H</m:t>
+        </m:r>
+        <m:r>
+          <m:rPr>
+            <m:sty m:val="p"/>
+          </m:rPr>
+          <m:t>=</m:t>
+        </m:r>
+        <m:r>
+          <m:t>0</m:t>
+        </m:r>
+      </m:oMath>
+      <w:r>
+        <w:t xml:space="preserve">) and myopic feedback loops (</w:t>
+      </w:r>
+      <m:oMath>
+        <m:r>
+          <m:t>H</m:t>
+        </m:r>
+        <m:r>
+          <m:rPr>
+            <m:sty m:val="p"/>
+          </m:rPr>
+          <m:t>=</m:t>
+        </m:r>
+        <m:r>
+          <m:t>1</m:t>
+        </m:r>
+      </m:oMath>
+      <w:r>
+        <w:t xml:space="preserve">) suffer rapid phase-space and causal collapse (</w:t>
+      </w:r>
+      <m:oMath>
+        <m:r>
+          <m:rPr>
+            <m:sty m:val="p"/>
+          </m:rPr>
+          <m:t>Φ</m:t>
+        </m:r>
+        <m:r>
+          <m:rPr>
+            <m:sty m:val="p"/>
+          </m:rPr>
+          <m:t>→</m:t>
+        </m:r>
+        <m:r>
+          <m:t>0</m:t>
+        </m:r>
+      </m:oMath>
+      <w:r>
+        <w:t xml:space="preserve">), establishing counterfactual temporal projection as a non-negotiable threshold of subjective mind.</w:t>
       </w:r>
     </w:p>
   </w:footnote>

</xml_diff>